<commit_message>
Refina portfolio com direcao visual minimalista
</commit_message>
<xml_diff>
--- a/assets/Enzo-Marinho-Curriculo-Visual.docx
+++ b/assets/Enzo-Marinho-Curriculo-Visual.docx
@@ -21,7 +21,7 @@
         <w:rPr>
           <w:rFonts w:ascii="Calibri" w:hAnsi="Calibri"/>
           <w:b/>
-          <w:color w:val="2DD4BF"/>
+          <w:color w:val="D4D4D8"/>
           <w:sz w:val="21"/>
         </w:rPr>
         <w:t>Direção | Conteúdo | Produção Audiovisual</w:t>
@@ -46,7 +46,7 @@
         <w:keepNext/>
         <w:spacing w:before="160" w:after="100"/>
         <w:pBdr>
-          <w:bottom w:val="single" w:sz="8" w:space="5" w:color="2DD4BF"/>
+          <w:bottom w:val="single" w:sz="8" w:space="5" w:color="8B5CF6"/>
         </w:pBdr>
       </w:pPr>
       <w:r>
@@ -72,7 +72,7 @@
         <w:keepNext/>
         <w:spacing w:before="160" w:after="100"/>
         <w:pBdr>
-          <w:bottom w:val="single" w:sz="8" w:space="5" w:color="2DD4BF"/>
+          <w:bottom w:val="single" w:sz="8" w:space="5" w:color="8B5CF6"/>
         </w:pBdr>
       </w:pPr>
       <w:r>
@@ -111,7 +111,7 @@
       <w:r>
         <w:rPr>
           <w:rFonts w:ascii="Calibri" w:hAnsi="Calibri"/>
-          <w:color w:val="B45309"/>
+          <w:color w:val="7C3AED"/>
           <w:sz w:val="18"/>
         </w:rPr>
         <w:t xml:space="preserve"> | Fev 2025 - Atual</w:t>
@@ -203,7 +203,7 @@
       <w:r>
         <w:rPr>
           <w:rFonts w:ascii="Calibri" w:hAnsi="Calibri"/>
-          <w:color w:val="B45309"/>
+          <w:color w:val="7C3AED"/>
           <w:sz w:val="18"/>
         </w:rPr>
         <w:t xml:space="preserve"> | 2025 - Atual</w:t>
@@ -289,7 +289,7 @@
         <w:keepNext/>
         <w:spacing w:before="160" w:after="100"/>
         <w:pBdr>
-          <w:bottom w:val="single" w:sz="8" w:space="5" w:color="2DD4BF"/>
+          <w:bottom w:val="single" w:sz="8" w:space="5" w:color="8B5CF6"/>
         </w:pBdr>
       </w:pPr>
       <w:r>
@@ -395,7 +395,7 @@
         <w:keepNext/>
         <w:spacing w:before="160" w:after="100"/>
         <w:pBdr>
-          <w:bottom w:val="single" w:sz="8" w:space="5" w:color="2DD4BF"/>
+          <w:bottom w:val="single" w:sz="8" w:space="5" w:color="8B5CF6"/>
         </w:pBdr>
       </w:pPr>
       <w:r>
@@ -435,7 +435,7 @@
         <w:keepNext/>
         <w:spacing w:before="160" w:after="100"/>
         <w:pBdr>
-          <w:bottom w:val="single" w:sz="8" w:space="5" w:color="2DD4BF"/>
+          <w:bottom w:val="single" w:sz="8" w:space="5" w:color="8B5CF6"/>
         </w:pBdr>
       </w:pPr>
       <w:r>

</xml_diff>